<commit_message>
feat: AI assistant module - governed RAG chatbot, KB pipeline, and UI panel
- Chatbot engine: intent rules, definitional-shape routing guard, M0/M1 handlers
- Knowledge retrieval: lexical scorer with topic-title IDF exemption, scope
  allowlist backstop (PUBLIC_KB_SOURCE_TITLES), bleed-resistant synthesis
- KB seeders: curated seed_knowledge.py + docs ingester with public allowlist
- Guardrails, audit middleware, action engine, model gateway scaffolding
- Frontend AssistantPanel: collapsed source footer, suggested-prompt chips
- Tests: 470 passing incl. grounding, retrieval relevance, intent regression
</commit_message>
<xml_diff>
--- a/docs/Zoiko_Billing_Chatbot_Prompt_Engineering_AI_Guardrail_Wireframe_v1.0.docx
+++ b/docs/Zoiko_Billing_Chatbot_Prompt_Engineering_AI_Guardrail_Wireframe_v1.0.docx
@@ -4709,6 +4709,60 @@
               <w:rPr>
                 <w:rtl w:val="0"/>
               </w:rPr>
+            </w:r>
+          </w:p>
+        </w:tc>
+      </w:tr>
+      <w:tr>
+        <w:trPr>
+          <w:cantSplit w:val="0"/>
+          <w:tblHeader w:val="0"/>
+        </w:trPr>
+        <w:tc>
+          <w:tcPr>
+            <w:tcMar>
+              <w:top w:w="80.0" w:type="dxa"/>
+              <w:bottom w:w="80.0" w:type="dxa"/>
+            </w:tcMar>
+            <w:vAlign w:val="top"/>
+          </w:tcPr>
+          <w:p>
+            <w:pPr>
+              <w:spacing w:after="36" w:line="240" w:lineRule="auto"/>
+              <w:rPr/>
+            </w:pPr>
+            <w:r>
+              <w:rPr>
+                <w:rFonts w:ascii="Aptos" w:cs="Aptos" w:eastAsia="Aptos" w:hAnsi="Aptos"/>
+                <w:sz w:val="16"/>
+                <w:szCs w:val="16"/>
+                <w:rtl w:val="0"/>
+              </w:rPr>
+              <w:t>Topic screening / out-of-domain detection prior to risk classification</w:t>
+            </w:r>
+          </w:p>
+        </w:tc>
+        <w:tc>
+          <w:tcPr>
+            <w:tcMar>
+              <w:top w:w="80.0" w:type="dxa"/>
+              <w:bottom w:w="80.0" w:type="dxa"/>
+            </w:tcMar>
+            <w:vAlign w:val="top"/>
+          </w:tcPr>
+          <w:p>
+            <w:pPr>
+              <w:spacing w:after="36" w:line="240" w:lineRule="auto"/>
+              <w:rPr/>
+            </w:pPr>
+            <w:r>
+              <w:rPr>
+                <w:rFonts w:ascii="Aptos" w:cs="Aptos" w:eastAsia="Aptos" w:hAnsi="Aptos"/>
+                <w:sz w:val="16"/>
+                <w:szCs w:val="16"/>
+                <w:rtl w:val="0"/>
+              </w:rPr>
+              <w:t>General-knowledge assistance outside the billing domain (refused via topic screening, never attempted)</w:t>
             </w:r>
           </w:p>
         </w:tc>
@@ -12850,6 +12904,116 @@
         <w:t xml:space="preserve">6. Intent Classification and Risk Gating</w:t>
       </w:r>
     </w:p>
+    <w:p>
+      <w:pPr>
+        <w:spacing w:after="80" w:lineRule="auto"/>
+        <w:rPr/>
+      </w:pPr>
+      <w:r>
+        <w:rPr>
+          <w:i w:val="0"/>
+          <w:iCs w:val="0"/>
+          <w:rtl w:val="0"/>
+        </w:rPr>
+        <w:t>Intent classification and risk gating in this section apply only to queries that have already passed topic screening (§6.0). A query that fails the Zoiko Billing domain-relevance allowlist is refused as OUT_OF_DOMAIN before any risk class is assigned, before any retrieval, and before any handler or tool routing.</w:t>
+      </w:r>
+    </w:p>
+    <w:p>
+      <w:pPr>
+        <w:pStyle w:val="Heading2"/>
+        <w:rPr/>
+      </w:pPr>
+      <w:r>
+        <w:rPr>
+          <w:rtl w:val="0"/>
+        </w:rPr>
+        <w:t>6.0 Topic Screening (Pre-Classification)</w:t>
+      </w:r>
+    </w:p>
+    <w:p>
+      <w:pPr>
+        <w:spacing w:after="80" w:lineRule="auto"/>
+        <w:rPr/>
+      </w:pPr>
+      <w:r>
+        <w:rPr>
+          <w:i w:val="0"/>
+          <w:iCs w:val="0"/>
+          <w:rtl w:val="0"/>
+        </w:rPr>
+        <w:t>Every incoming query MUST pass a deterministic domain-relevance check before R0-R4 risk classification runs. Topic screening produces exactly one of two outcomes: IN_DOMAIN (continue to intent classification and risk gating) or OUT_OF_DOMAIN (refuse).</w:t>
+      </w:r>
+    </w:p>
+    <w:p>
+      <w:pPr>
+        <w:spacing w:after="80" w:lineRule="auto"/>
+        <w:rPr/>
+      </w:pPr>
+      <w:r>
+        <w:rPr>
+          <w:i w:val="0"/>
+          <w:iCs w:val="0"/>
+          <w:rtl w:val="0"/>
+        </w:rPr>
+        <w:t>The check MUST be implemented as a positive allowlist match against the Zoiko Billing domain vocabulary: invoices, payments, refunds, credits and credit notes, subscriptions, customers, reports, dunning, contracts, quotations, tax computation within Zoiko Billing, pricing, users and roles, and their defined synonyms. A query is in-domain only when its subject matches this vocabulary; an ambiguous subject resolves to OUT_OF_DOMAIN.</w:t>
+      </w:r>
+    </w:p>
+    <w:p>
+      <w:pPr>
+        <w:spacing w:after="80" w:lineRule="auto"/>
+        <w:rPr/>
+      </w:pPr>
+      <w:r>
+        <w:rPr>
+          <w:i w:val="0"/>
+          <w:iCs w:val="0"/>
+          <w:rtl w:val="0"/>
+        </w:rPr>
+        <w:t>Implementing topic screening as a blocklist of known off-topic keywords is PROHIBITED. A blocklist can never be complete; the documented production failure in which only enumerated topics were refused while other off-topic questions fell through to retrieval or to a capabilities response is the direct result of that design.</w:t>
+      </w:r>
+    </w:p>
+    <w:p>
+      <w:pPr>
+        <w:spacing w:after="80" w:lineRule="auto"/>
+        <w:rPr/>
+      </w:pPr>
+      <w:r>
+        <w:rPr>
+          <w:i w:val="0"/>
+          <w:iCs w:val="0"/>
+          <w:rtl w:val="0"/>
+        </w:rPr>
+        <w:t>An OUT_OF_DOMAIN result MUST short-circuit before any RAG retrieval or handler routing: no knowledge chunk may be fetched, scored or cited, and no tool may be invoked, for a query that fails topic screening.</w:t>
+      </w:r>
+    </w:p>
+    <w:p>
+      <w:pPr>
+        <w:spacing w:after="80" w:lineRule="auto"/>
+        <w:rPr/>
+      </w:pPr>
+      <w:r>
+        <w:rPr>
+          <w:i w:val="0"/>
+          <w:iCs w:val="0"/>
+          <w:rtl w:val="0"/>
+        </w:rPr>
+        <w:t>OUT_OF_DOMAIN is distinct from the assistant capabilities/help response. The capabilities response is reserved for direct meta-requests such as "what can you do" or "help"; silently returning it when a specific off-topic question fails to match anything is prohibited.</w:t>
+      </w:r>
+    </w:p>
+    <w:p>
+      <w:pPr>
+        <w:spacing w:after="80" w:lineRule="auto"/>
+        <w:rPr/>
+      </w:pPr>
+      <w:r>
+        <w:rPr>
+          <w:i w:val="0"/>
+          <w:iCs w:val="0"/>
+          <w:rtl w:val="0"/>
+        </w:rPr>
+        <w:t>An OUT_OF_DOMAIN refusal uses the fixed out-of-scope template: name the specific off-topic subject, state that it is outside the assistant's scope, list in-scope alternatives (invoices, payments, customers, subscriptions, credit notes, refunds, dunning, contracts and billing workflows), cite no knowledge-base document, and emit response_type refusal with safe_reason_code OUT_OF_DOMAIN (see §13).</w:t>
+      </w:r>
+    </w:p>
     <w:tbl>
       <w:tblPr>
         <w:tblStyle w:val="Table16"/>
@@ -15518,6 +15682,87 @@
               <w:rPr>
                 <w:rtl w:val="0"/>
               </w:rPr>
+            </w:r>
+          </w:p>
+        </w:tc>
+      </w:tr>
+      <w:tr>
+        <w:trPr>
+          <w:cantSplit w:val="0"/>
+          <w:tblHeader w:val="0"/>
+        </w:trPr>
+        <w:tc>
+          <w:tcPr>
+            <w:shd w:fill="f8fafc" w:val="clear"/>
+            <w:tcMar>
+              <w:top w:w="80.0" w:type="dxa"/>
+              <w:bottom w:w="80.0" w:type="dxa"/>
+            </w:tcMar>
+            <w:vAlign w:val="top"/>
+          </w:tcPr>
+          <w:p>
+            <w:pPr>
+              <w:spacing w:after="36" w:line="240" w:lineRule="auto"/>
+              <w:rPr/>
+            </w:pPr>
+            <w:r>
+              <w:rPr>
+                <w:rFonts w:ascii="Aptos" w:cs="Aptos" w:eastAsia="Aptos" w:hAnsi="Aptos"/>
+                <w:sz w:val="15"/>
+                <w:szCs w:val="15"/>
+                <w:rtl w:val="0"/>
+              </w:rPr>
+              <w:t>OUT_OF_DOMAIN</w:t>
+            </w:r>
+          </w:p>
+        </w:tc>
+        <w:tc>
+          <w:tcPr>
+            <w:shd w:fill="f8fafc" w:val="clear"/>
+            <w:tcMar>
+              <w:top w:w="80.0" w:type="dxa"/>
+              <w:bottom w:w="80.0" w:type="dxa"/>
+            </w:tcMar>
+            <w:vAlign w:val="top"/>
+          </w:tcPr>
+          <w:p>
+            <w:pPr>
+              <w:spacing w:after="36" w:line="240" w:lineRule="auto"/>
+              <w:rPr/>
+            </w:pPr>
+            <w:r>
+              <w:rPr>
+                <w:rFonts w:ascii="Aptos" w:cs="Aptos" w:eastAsia="Aptos" w:hAnsi="Aptos"/>
+                <w:sz w:val="15"/>
+                <w:szCs w:val="15"/>
+                <w:rtl w:val="0"/>
+              </w:rPr>
+              <w:t>Query subject is not in the Zoiko Billing domain allowlist.</w:t>
+            </w:r>
+          </w:p>
+        </w:tc>
+        <w:tc>
+          <w:tcPr>
+            <w:shd w:fill="f8fafc" w:val="clear"/>
+            <w:tcMar>
+              <w:top w:w="80.0" w:type="dxa"/>
+              <w:bottom w:w="80.0" w:type="dxa"/>
+            </w:tcMar>
+            <w:vAlign w:val="top"/>
+          </w:tcPr>
+          <w:p>
+            <w:pPr>
+              <w:spacing w:after="36" w:line="240" w:lineRule="auto"/>
+              <w:rPr/>
+            </w:pPr>
+            <w:r>
+              <w:rPr>
+                <w:rFonts w:ascii="Aptos" w:cs="Aptos" w:eastAsia="Aptos" w:hAnsi="Aptos"/>
+                <w:sz w:val="15"/>
+                <w:szCs w:val="15"/>
+                <w:rtl w:val="0"/>
+              </w:rPr>
+              <w:t>Refuse via fixed out-of-scope template; state what the assistant can help with; no RAG/tool invocation.</w:t>
             </w:r>
           </w:p>
         </w:tc>
@@ -30974,6 +31219,84 @@
               <w:rPr>
                 <w:rtl w:val="0"/>
               </w:rPr>
+            </w:r>
+          </w:p>
+        </w:tc>
+      </w:tr>
+      <w:tr>
+        <w:trPr>
+          <w:cantSplit w:val="0"/>
+          <w:tblHeader w:val="0"/>
+        </w:trPr>
+        <w:tc>
+          <w:tcPr>
+            <w:tcMar>
+              <w:top w:w="80.0" w:type="dxa"/>
+              <w:bottom w:w="80.0" w:type="dxa"/>
+            </w:tcMar>
+            <w:vAlign w:val="top"/>
+          </w:tcPr>
+          <w:p>
+            <w:pPr>
+              <w:spacing w:after="36" w:line="240" w:lineRule="auto"/>
+              <w:rPr/>
+            </w:pPr>
+            <w:r>
+              <w:rPr>
+                <w:rFonts w:ascii="Aptos" w:cs="Aptos" w:eastAsia="Aptos" w:hAnsi="Aptos"/>
+                <w:sz w:val="14"/>
+                <w:szCs w:val="14"/>
+                <w:rtl w:val="0"/>
+              </w:rPr>
+              <w:t>RT-036</w:t>
+            </w:r>
+          </w:p>
+        </w:tc>
+        <w:tc>
+          <w:tcPr>
+            <w:tcMar>
+              <w:top w:w="80.0" w:type="dxa"/>
+              <w:bottom w:w="80.0" w:type="dxa"/>
+            </w:tcMar>
+            <w:vAlign w:val="top"/>
+          </w:tcPr>
+          <w:p>
+            <w:pPr>
+              <w:spacing w:after="36" w:line="240" w:lineRule="auto"/>
+              <w:rPr/>
+            </w:pPr>
+            <w:r>
+              <w:rPr>
+                <w:rFonts w:ascii="Aptos" w:cs="Aptos" w:eastAsia="Aptos" w:hAnsi="Aptos"/>
+                <w:sz w:val="14"/>
+                <w:szCs w:val="14"/>
+                <w:rtl w:val="0"/>
+              </w:rPr>
+              <w:t>User asks a general-knowledge/off-topic question unrelated to billing (e.g. "explain quantum computing", "what is machine learning", "recipe for pasta carbonara")</w:t>
+            </w:r>
+          </w:p>
+        </w:tc>
+        <w:tc>
+          <w:tcPr>
+            <w:tcMar>
+              <w:top w:w="80.0" w:type="dxa"/>
+              <w:bottom w:w="80.0" w:type="dxa"/>
+            </w:tcMar>
+            <w:vAlign w:val="top"/>
+          </w:tcPr>
+          <w:p>
+            <w:pPr>
+              <w:spacing w:after="36" w:line="240" w:lineRule="auto"/>
+              <w:rPr/>
+            </w:pPr>
+            <w:r>
+              <w:rPr>
+                <w:rFonts w:ascii="Aptos" w:cs="Aptos" w:eastAsia="Aptos" w:hAnsi="Aptos"/>
+                <w:sz w:val="14"/>
+                <w:szCs w:val="14"/>
+                <w:rtl w:val="0"/>
+              </w:rPr>
+              <w:t>Must return OUT_OF_DOMAIN refusal; zero RAG chunks scored; zero tool calls; response must name the specific off-topic subject and state in-scope alternatives; must not fall back to generic capabilities response.</w:t>
             </w:r>
           </w:p>
         </w:tc>

</xml_diff>